<commit_message>
Globalize professional application document design
Co-authored-by: arena-agent <297053741+arena-agent@users.noreply.github.com>
</commit_message>
<xml_diff>
--- a/documents/live_market_test_2026-09-30/watch_aeb9c295fd34296adf_medical_officer_cover_letter.docx
+++ b/documents/live_market_test_2026-09-30/watch_aeb9c295fd34296adf_medical_officer_cover_letter.docx
@@ -4,181 +4,203 @@
   <w:body>
     <w:p>
       <w:pPr>
-        <w:spacing w:after="50"/>
+        <w:pStyle w:val="JFName"/>
       </w:pPr>
       <w:r>
-        <w:rPr>
-          <w:sz w:val="17"/>
-        </w:rPr>
-        <w:t>Subject: FMIC/HR/571 — Medical Officer</w:t>
+        <w:t>Allah Yar Frotan</w:t>
       </w:r>
     </w:p>
     <w:p>
       <w:pPr>
-        <w:spacing w:after="50"/>
+        <w:pStyle w:val="JFTitle"/>
       </w:pPr>
       <w:r>
-        <w:rPr>
-          <w:sz w:val="17"/>
-        </w:rPr>
+        <w:t>Medical Doctor | Health &amp; Nutrition Program Coordination</w:t>
+      </w:r>
+    </w:p>
+    <w:p>
+      <w:pPr>
+        <w:pStyle w:val="JFContact"/>
+      </w:pPr>
+      <w:r>
+        <w:t>Kabul, Afghanistan | +93766462006 | alfrotan@gmail.com</w:t>
+      </w:r>
+    </w:p>
+    <w:p>
+      <w:pPr>
+        <w:pStyle w:val="JFLabel"/>
+      </w:pPr>
+      <w:r>
+        <w:t>APPLICATION LETTER — Medical Officer — French Medical Institute for Mothers and Children (FMIC)</w:t>
+      </w:r>
+    </w:p>
+    <w:p>
+      <w:pPr>
+        <w:pStyle w:val="JFContact"/>
+      </w:pPr>
+      <w:r>
+        <w:t>To: Hiring Committee, French Medical Institute for Mothers and Children (FMIC) | Reference: FMIC/HR/571</w:t>
+      </w:r>
+    </w:p>
+    <w:p>
+      <w:pPr>
+        <w:pStyle w:val="JFSection"/>
+      </w:pPr>
+      <w:r>
+        <w:t>SUBJECT</w:t>
+      </w:r>
+    </w:p>
+    <w:p>
+      <w:pPr>
+        <w:pStyle w:val="JFSection"/>
+      </w:pPr>
+      <w:r>
+        <w:t>FMIC/HR/571 — Medical Officer</w:t>
+      </w:r>
+    </w:p>
+    <w:p>
+      <w:pPr>
+        <w:pStyle w:val="JFBody"/>
+      </w:pPr>
+      <w:r>
         <w:t>Dear Hiring Committee,</w:t>
       </w:r>
     </w:p>
     <w:p>
       <w:pPr>
-        <w:spacing w:after="50"/>
+        <w:pStyle w:val="JFBody"/>
       </w:pPr>
       <w:r>
-        <w:rPr>
-          <w:sz w:val="17"/>
-        </w:rPr>
         <w:t>I am writing to apply for the Medical Officer position in Kabul, Afghanistan at French Medical Institute for Mothers and Children (FMIC).</w:t>
       </w:r>
     </w:p>
     <w:p>
       <w:pPr>
-        <w:spacing w:after="50"/>
+        <w:pStyle w:val="JFBody"/>
       </w:pPr>
       <w:r>
-        <w:rPr>
-          <w:sz w:val="17"/>
-        </w:rPr>
         <w:t>I understand that the vacancy emphasizes quality improvement and patient safety, clinical assessment, diagnosis and treatment, infection prevention and control.</w:t>
       </w:r>
     </w:p>
     <w:p>
       <w:pPr>
-        <w:spacing w:after="50"/>
+        <w:pStyle w:val="JFBody"/>
       </w:pPr>
       <w:r>
-        <w:rPr>
-          <w:sz w:val="17"/>
-        </w:rPr>
         <w:t>My relevant experience includes:</w:t>
       </w:r>
     </w:p>
     <w:p>
       <w:pPr>
-        <w:spacing w:after="12"/>
-        <w:ind w:left="259" w:hanging="173"/>
+        <w:pStyle w:val="JFBody"/>
+        <w:ind w:left="317" w:hanging="173"/>
       </w:pPr>
       <w:r>
-        <w:rPr>
-          <w:sz w:val="17"/>
-        </w:rPr>
-        <w:t>- Delivered clinical assessment, diagnosis, treatment, and follow-up care for children with SAM applying WHO, IMAM/CMAM, and national clinical protocols. (TFU Medical Doctor &amp; Safeguarding Focal Point | Action Against Hunger (ACF-International) | Sang-e-Takht TFU, Daikundi (2023-05 – 2025-07))</w:t>
+        <w:t>• Delivered clinical assessment, diagnosis, treatment, and follow-up care for children with SAM applying WHO, IMAM/CMAM, and national clinical protocols. (TFU Medical Doctor &amp; Safeguarding Focal Point | Action Against Hunger (ACF-International) | Sang-e-Takht TFU, Daikundi (2023-05 – 2025-07))</w:t>
       </w:r>
     </w:p>
     <w:p>
       <w:pPr>
-        <w:spacing w:after="12"/>
-        <w:ind w:left="259" w:hanging="173"/>
+        <w:pStyle w:val="JFBody"/>
+        <w:ind w:left="317" w:hanging="173"/>
       </w:pPr>
       <w:r>
-        <w:rPr>
-          <w:sz w:val="17"/>
-        </w:rPr>
-        <w:t>- Coordinated with Ministry of Public Health representatives, provincial health authorities, and partner organizations. (Medical Doctor / COVID-19 Rapid Response Team Leader | Daikundi Provincial Public Health Directorate | Daikundi, Afghanistan (2020-10 – 2020-12))</w:t>
+        <w:t>• Coordinated with Ministry of Public Health representatives, provincial health authorities, and partner organizations. (Medical Doctor / COVID-19 Rapid Response Team Leader | Daikundi Provincial Public Health Directorate | Daikundi, Afghanistan (2020-10 – 2020-12))</w:t>
       </w:r>
     </w:p>
     <w:p>
       <w:pPr>
-        <w:spacing w:after="12"/>
-        <w:ind w:left="259" w:hanging="173"/>
+        <w:pStyle w:val="JFBody"/>
+        <w:ind w:left="317" w:hanging="173"/>
       </w:pPr>
       <w:r>
-        <w:rPr>
-          <w:sz w:val="17"/>
-        </w:rPr>
-        <w:t>- Supported administrative operations, procurement processes, financial documentation, and program logistics. (Administrative and Finance Officer | Trend for a Better Tomorrow (TBT) – NGO | Afghanistan (2019-05 – 2019-09))</w:t>
+        <w:t>• Supported administrative operations, procurement processes, financial documentation, and program logistics. (Administrative and Finance Officer | Trend for a Better Tomorrow (TBT) – NGO | Afghanistan (2019-05 – 2019-09))</w:t>
       </w:r>
     </w:p>
     <w:p>
       <w:pPr>
-        <w:spacing w:after="12"/>
-        <w:ind w:left="259" w:hanging="173"/>
+        <w:pStyle w:val="JFBody"/>
+        <w:ind w:left="317" w:hanging="173"/>
       </w:pPr>
       <w:r>
-        <w:rPr>
-          <w:sz w:val="17"/>
-        </w:rPr>
-        <w:t>- Supervised mobile health and nutrition teams delivering community-based BPHS/EPHS-related services. (Health and Nutrition Supervisor | Action Against Hunger (ACF-International) | Gizab &amp; Sang-e-Takht, Daikundi (2022-02 – 2022-12))</w:t>
+        <w:t>• Supervised mobile health and nutrition teams delivering community-based BPHS/EPHS-related services. (Health and Nutrition Supervisor | Action Against Hunger (ACF-International) | Gizab &amp; Sang-e-Takht, Daikundi (2022-02 – 2022-12))</w:t>
       </w:r>
     </w:p>
     <w:p>
       <w:pPr>
-        <w:spacing w:after="50"/>
+        <w:pStyle w:val="JFBody"/>
       </w:pPr>
       <w:r>
-        <w:rPr>
-          <w:sz w:val="17"/>
-        </w:rPr>
         <w:t>My medical education includes Doctor of Medicine (MD), Curative Medicine — Kabul Medical Science University — 2013 — 2020.</w:t>
       </w:r>
     </w:p>
     <w:p>
       <w:pPr>
-        <w:spacing w:after="50"/>
+        <w:pStyle w:val="JFBody"/>
       </w:pPr>
       <w:r>
-        <w:rPr>
-          <w:sz w:val="17"/>
-        </w:rPr>
         <w:t>I also meet the professional medical registration/license requirement stated for the role.</w:t>
       </w:r>
     </w:p>
     <w:p>
       <w:pPr>
-        <w:spacing w:after="50"/>
+        <w:pStyle w:val="JFBody"/>
       </w:pPr>
       <w:r>
-        <w:rPr>
-          <w:sz w:val="17"/>
-        </w:rPr>
         <w:t>My verified language profile is Dari/Persian — Native, English — Fluent, Pashto — Intermediate.</w:t>
       </w:r>
     </w:p>
     <w:p>
       <w:pPr>
-        <w:spacing w:after="50"/>
+        <w:pStyle w:val="JFBody"/>
       </w:pPr>
       <w:r>
-        <w:rPr>
-          <w:sz w:val="17"/>
-        </w:rPr>
         <w:t>I would welcome the opportunity to discuss how my experience can support your health program and the communities served by this position.</w:t>
       </w:r>
     </w:p>
     <w:p>
       <w:pPr>
-        <w:spacing w:after="50"/>
+        <w:pStyle w:val="JFBody"/>
       </w:pPr>
       <w:r>
-        <w:rPr>
-          <w:sz w:val="17"/>
-        </w:rPr>
         <w:t>Sincerely,</w:t>
       </w:r>
     </w:p>
     <w:p>
       <w:pPr>
-        <w:spacing w:after="50"/>
+        <w:pStyle w:val="JFSignature"/>
       </w:pPr>
       <w:r>
-        <w:rPr>
-          <w:sz w:val="17"/>
-        </w:rPr>
         <w:t>Allah Yar Frotan</w:t>
       </w:r>
     </w:p>
     <w:sectPr>
+      <w:footerReference w:type="default" r:id="rId9"/>
       <w:pgSz w:w="12240" w:h="15840"/>
-      <w:pgMar w:top="792" w:right="936" w:bottom="792" w:left="936" w:header="720" w:footer="720" w:gutter="0"/>
+      <w:pgMar w:top="893" w:right="1037" w:bottom="893" w:left="1037" w:header="720" w:footer="720" w:gutter="0"/>
       <w:cols w:space="720"/>
       <w:docGrid w:linePitch="360"/>
     </w:sectPr>
   </w:body>
 </w:document>
+</file>
+
+<file path=word/footer1.xml><?xml version="1.0" encoding="utf-8"?>
+<w:ftr xmlns:m="http://schemas.openxmlformats.org/officeDocument/2006/math" xmlns:mc="http://schemas.openxmlformats.org/markup-compatibility/2006" xmlns:mo="http://schemas.microsoft.com/office/mac/office/2008/main" xmlns:mv="urn:schemas-microsoft-com:mac:vml" xmlns:o="urn:schemas-microsoft-com:office:office" xmlns:r="http://schemas.openxmlformats.org/officeDocument/2006/relationships" xmlns:v="urn:schemas-microsoft-com:vml" xmlns:w10="urn:schemas-microsoft-com:office:word" xmlns:w14="http://schemas.microsoft.com/office/word/2010/wordml" xmlns:w="http://schemas.openxmlformats.org/wordprocessingml/2006/main" xmlns:wne="http://schemas.microsoft.com/office/word/2006/wordml" xmlns:wp14="http://schemas.microsoft.com/office/word/2010/wordprocessingDrawing" xmlns:wp="http://schemas.openxmlformats.org/drawingml/2006/wordprocessingDrawing" xmlns:wpc="http://schemas.microsoft.com/office/word/2010/wordprocessingCanvas" xmlns:wpg="http://schemas.microsoft.com/office/word/2010/wordprocessingGroup" xmlns:wpi="http://schemas.microsoft.com/office/word/2010/wordprocessingInk" xmlns:wps="http://schemas.microsoft.com/office/word/2010/wordprocessingShape" mc:Ignorable="w14 wp14">
+  <w:p>
+    <w:pPr>
+      <w:pStyle w:val="Footer"/>
+      <w:jc w:val="center"/>
+    </w:pPr>
+    <w:r>
+      <w:rPr>
+        <w:color w:val="66737A"/>
+        <w:sz w:val="14"/>
+      </w:rPr>
+      <w:t>Jobs-Finder review package · no submission performed</w:t>
+    </w:r>
+  </w:p>
+</w:ftr>
 </file>
 
 <file path=word/numbering.xml><?xml version="1.0" encoding="utf-8"?>
@@ -544,12 +566,9 @@
     <w:name w:val="Normal"/>
     <w:qFormat/>
     <w:rsid w:val="00FC693F"/>
-    <w:pPr>
-      <w:spacing w:after="40"/>
-    </w:pPr>
     <w:rPr>
-      <w:rFonts w:ascii="Aptos" w:hAnsi="Aptos"/>
-      <w:sz w:val="17"/>
+      <w:rFonts w:ascii="Aptos" w:hAnsi="Aptos" w:eastAsia="Aptos"/>
+      <w:sz w:val="18"/>
     </w:rPr>
   </w:style>
   <w:style w:type="paragraph" w:styleId="Header">
@@ -611,11 +630,11 @@
       <w:outlineLvl w:val="0"/>
     </w:pPr>
     <w:rPr>
-      <w:rFonts w:asciiTheme="majorHAnsi" w:eastAsiaTheme="majorEastAsia" w:hAnsiTheme="majorHAnsi" w:cstheme="majorBidi" w:ascii="Aptos Display" w:hAnsi="Aptos Display"/>
+      <w:rFonts w:asciiTheme="majorHAnsi" w:eastAsiaTheme="majorEastAsia" w:hAnsiTheme="majorHAnsi" w:cstheme="majorBidi"/>
       <w:b/>
       <w:bCs/>
       <w:color w:val="365F91" w:themeColor="accent1" w:themeShade="BF"/>
-      <w:sz w:val="36"/>
+      <w:sz w:val="28"/>
       <w:szCs w:val="28"/>
     </w:rPr>
   </w:style>
@@ -635,11 +654,11 @@
       <w:outlineLvl w:val="1"/>
     </w:pPr>
     <w:rPr>
-      <w:rFonts w:asciiTheme="majorHAnsi" w:eastAsiaTheme="majorEastAsia" w:hAnsiTheme="majorHAnsi" w:cstheme="majorBidi" w:ascii="Aptos Display" w:hAnsi="Aptos Display"/>
+      <w:rFonts w:asciiTheme="majorHAnsi" w:eastAsiaTheme="majorEastAsia" w:hAnsiTheme="majorHAnsi" w:cstheme="majorBidi"/>
       <w:b/>
       <w:bCs/>
-      <w:color w:val="1F4E79"/>
-      <w:sz w:val="21"/>
+      <w:color w:val="4F81BD" w:themeColor="accent1"/>
+      <w:sz w:val="26"/>
       <w:szCs w:val="26"/>
     </w:rPr>
   </w:style>
@@ -659,11 +678,10 @@
       <w:outlineLvl w:val="2"/>
     </w:pPr>
     <w:rPr>
-      <w:rFonts w:asciiTheme="majorHAnsi" w:eastAsiaTheme="majorEastAsia" w:hAnsiTheme="majorHAnsi" w:cstheme="majorBidi" w:ascii="Aptos" w:hAnsi="Aptos"/>
+      <w:rFonts w:asciiTheme="majorHAnsi" w:eastAsiaTheme="majorEastAsia" w:hAnsiTheme="majorHAnsi" w:cstheme="majorBidi"/>
       <w:b/>
       <w:bCs/>
       <w:color w:val="4F81BD" w:themeColor="accent1"/>
-      <w:sz w:val="20"/>
     </w:rPr>
   </w:style>
   <w:style w:type="paragraph" w:styleId="Heading4">
@@ -12234,6 +12252,90 @@
         <w:shd w:val="clear" w:color="auto" w:fill="FBCAA2" w:themeFill="accent6" w:themeFillTint="7F"/>
       </w:tcPr>
     </w:tblStylePr>
+  </w:style>
+  <w:style w:type="paragraph" w:customStyle="1" w:styleId="JFName">
+    <w:name w:val="JF Name"/>
+    <w:pPr>
+      <w:spacing w:after="40"/>
+    </w:pPr>
+    <w:rPr>
+      <w:rFonts w:ascii="Georgia" w:hAnsi="Georgia" w:eastAsia="Georgia"/>
+      <w:b/>
+      <w:color w:val="0C3442"/>
+      <w:sz w:val="44"/>
+    </w:rPr>
+  </w:style>
+  <w:style w:type="paragraph" w:customStyle="1" w:styleId="JFTitle">
+    <w:name w:val="JF Title"/>
+    <w:pPr>
+      <w:spacing w:after="40"/>
+    </w:pPr>
+    <w:rPr>
+      <w:rFonts w:ascii="Aptos" w:hAnsi="Aptos" w:eastAsia="Aptos"/>
+      <w:b w:val="0"/>
+      <w:color w:val="157C78"/>
+      <w:sz w:val="20"/>
+    </w:rPr>
+  </w:style>
+  <w:style w:type="paragraph" w:customStyle="1" w:styleId="JFContact">
+    <w:name w:val="JF Contact"/>
+    <w:pPr>
+      <w:spacing w:after="40"/>
+    </w:pPr>
+    <w:rPr>
+      <w:rFonts w:ascii="Aptos" w:hAnsi="Aptos" w:eastAsia="Aptos"/>
+      <w:b w:val="0"/>
+      <w:color w:val="66737A"/>
+      <w:sz w:val="16"/>
+    </w:rPr>
+  </w:style>
+  <w:style w:type="paragraph" w:customStyle="1" w:styleId="JFLabel">
+    <w:name w:val="JF Label"/>
+    <w:pPr>
+      <w:spacing w:after="40"/>
+    </w:pPr>
+    <w:rPr>
+      <w:rFonts w:ascii="Aptos" w:hAnsi="Aptos" w:eastAsia="Aptos"/>
+      <w:b/>
+      <w:color w:val="A88449"/>
+      <w:sz w:val="14"/>
+    </w:rPr>
+  </w:style>
+  <w:style w:type="paragraph" w:customStyle="1" w:styleId="JFSection">
+    <w:name w:val="JF Section"/>
+    <w:pPr>
+      <w:spacing w:after="40"/>
+    </w:pPr>
+    <w:rPr>
+      <w:rFonts w:ascii="Aptos" w:hAnsi="Aptos" w:eastAsia="Aptos"/>
+      <w:b/>
+      <w:color w:val="0C3442"/>
+      <w:sz w:val="20"/>
+    </w:rPr>
+  </w:style>
+  <w:style w:type="paragraph" w:customStyle="1" w:styleId="JFBody">
+    <w:name w:val="JF Body"/>
+    <w:pPr>
+      <w:spacing w:after="40"/>
+    </w:pPr>
+    <w:rPr>
+      <w:rFonts w:ascii="Aptos" w:hAnsi="Aptos" w:eastAsia="Aptos"/>
+      <w:b w:val="0"/>
+      <w:color w:val="172A35"/>
+      <w:sz w:val="18"/>
+    </w:rPr>
+  </w:style>
+  <w:style w:type="paragraph" w:customStyle="1" w:styleId="JFSignature">
+    <w:name w:val="JF Signature"/>
+    <w:pPr>
+      <w:spacing w:after="40"/>
+    </w:pPr>
+    <w:rPr>
+      <w:rFonts w:ascii="Georgia" w:hAnsi="Georgia" w:eastAsia="Georgia"/>
+      <w:b/>
+      <w:color w:val="0C3442"/>
+      <w:sz w:val="24"/>
+    </w:rPr>
   </w:style>
 </w:styles>
 </file>

</xml_diff>